<commit_message>
Implement domestic violence affidavit v3 template
</commit_message>
<xml_diff>
--- a/templates/Domestic Violence Affidavit.docx
+++ b/templates/Domestic Violence Affidavit.docx
@@ -1,8 +1,8 @@
 
 <file path=word/document.xml><?xml version="1.0" encoding="utf-8"?>
-<w:document xmlns:ns1="http://schemas.openxmlformats.org/markup-compatibility/2006" xmlns:ns2="http://schemas.microsoft.com/office/word/2010/wordml" xmlns:ns3="http://schemas.openxmlformats.org/officeDocument/2006/relationships" xmlns:w="http://schemas.openxmlformats.org/wordprocessingml/2006/main" ns1:Ignorable="w14 w15 w16se w16cid w16 w16cex w16sdtdh w16sdtfl w16du wp14">
+<w:document xmlns:wpc="http://schemas.microsoft.com/office/word/2010/wordprocessingCanvas" xmlns:cx="http://schemas.microsoft.com/office/drawing/2014/chartex" xmlns:cx1="http://schemas.microsoft.com/office/drawing/2015/9/8/chartex" xmlns:cx2="http://schemas.microsoft.com/office/drawing/2015/10/21/chartex" xmlns:cx3="http://schemas.microsoft.com/office/drawing/2016/5/9/chartex" xmlns:cx4="http://schemas.microsoft.com/office/drawing/2016/5/10/chartex" xmlns:cx5="http://schemas.microsoft.com/office/drawing/2016/5/11/chartex" xmlns:cx6="http://schemas.microsoft.com/office/drawing/2016/5/12/chartex" xmlns:cx7="http://schemas.microsoft.com/office/drawing/2016/5/13/chartex" xmlns:cx8="http://schemas.microsoft.com/office/drawing/2016/5/14/chartex" xmlns:mc="http://schemas.openxmlformats.org/markup-compatibility/2006" xmlns:m="http://schemas.openxmlformats.org/officeDocument/2006/math" xmlns:aink="http://schemas.microsoft.com/office/drawing/2016/ink" xmlns:am3d="http://schemas.microsoft.com/office/drawing/2017/model3d" xmlns:oel="http://schemas.microsoft.com/office/2019/extlst" xmlns:r="http://schemas.openxmlformats.org/officeDocument/2006/relationships" xmlns:wp14="http://schemas.microsoft.com/office/word/2010/wordprocessingDrawing" xmlns:wp="http://schemas.openxmlformats.org/drawingml/2006/wordprocessingDrawing" xmlns:wpg="http://schemas.microsoft.com/office/word/2010/wordprocessingGroup" xmlns:wpi="http://schemas.microsoft.com/office/word/2010/wordprocessingInk" xmlns:wps="http://schemas.microsoft.com/office/word/2010/wordprocessingShape" xmlns:o="urn:schemas-microsoft-com:office:office" xmlns:v="urn:schemas-microsoft-com:vml" xmlns:w10="urn:schemas-microsoft-com:office:word" xmlns:w="http://schemas.openxmlformats.org/wordprocessingml/2006/main" xmlns:w14="http://schemas.microsoft.com/office/word/2010/wordml" xmlns:w15="http://schemas.microsoft.com/office/word/2012/wordml" xmlns:w16cex="http://schemas.microsoft.com/office/word/2018/wordml/cex" xmlns:w16cid="http://schemas.microsoft.com/office/word/2016/wordml/cid" xmlns:w16="http://schemas.microsoft.com/office/word/2018/wordml" xmlns:w16sdtdh="http://schemas.microsoft.com/office/word/2020/wordml/sdtdatahash" xmlns:w16sdtfl="http://schemas.microsoft.com/office/word/2024/wordml/sdtformatlock" xmlns:w16se="http://schemas.microsoft.com/office/word/2015/wordml/symex" xmlns:w16du="http://schemas.microsoft.com/office/word/2023/wordml/word16du" xmlns:wne="http://schemas.microsoft.com/office/word/2006/wordml" mc:Ignorable="w14 w15 w16se w16cid w16 w16cex w16sdtdh w16sdtfl w16du wp14">
   <w:body>
-    <w:p ns2:paraId="2968A18A" ns2:textId="77777777">
+    <w:p>
       <w:pPr>
         <w:ind w:right="-136"/>
         <w:rPr>
@@ -18,7 +18,7 @@
         <w:t xml:space="preserve">I TE KŌTI-A-WHĀNAU  </w:t>
       </w:r>
     </w:p>
-    <w:p ns2:paraId="2E09E9C6" ns2:textId="336AEC1E">
+    <w:p>
       <w:pPr>
         <w:ind w:right="-136"/>
         <w:rPr>
@@ -43,109 +43,79 @@
       </w:r>
       <w:r>
         <w:rPr>
+          <w:b/>
+        </w:rPr>
+        <w:t xml:space="preserve"> </w:t>
+      </w:r>
+    </w:p>
+    <w:p>
+      <w:pPr>
+        <w:ind w:right="-136"/>
+        <w:rPr>
+          <w:b/>
+        </w:rPr>
+      </w:pPr>
+    </w:p>
+    <w:p>
+      <w:pPr>
+        <w:ind w:right="-136"/>
+        <w:rPr>
+          <w:b/>
+        </w:rPr>
+      </w:pPr>
+      <w:r>
+        <w:rPr>
+          <w:b/>
+        </w:rPr>
+        <w:t xml:space="preserve">IN THE </w:t>
+      </w:r>
+      <w:r>
+        <w:rPr>
           <w:rFonts w:cs="Arial"/>
           <w:b/>
-          <w:color w:val="202124"/>
-          <w:shd w:val="clear" w:color="auto" w:fill="FFFFFF"/>
-        </w:rPr>
-        <w:t/>
-      </w:r>
-      <w:r>
-        <w:rPr>
-          <w:rFonts w:cs="Arial"/>
-          <w:b/>
-          <w:color w:val="202124"/>
-          <w:shd w:val="clear" w:color="auto" w:fill="FFFFFF"/>
-        </w:rPr>
-        <w:t/>
-      </w:r>
-      <w:r>
-        <w:rPr>
-          <w:b/>
-        </w:rPr>
-        <w:t xml:space="preserve"> </w:t>
-      </w:r>
-    </w:p>
-    <w:p ns2:paraId="4D5A2513" ns2:textId="77777777">
+        </w:rPr>
+        <w:t xml:space="preserve">FAMILY </w:t>
+      </w:r>
+      <w:r>
+        <w:rPr>
+          <w:b/>
+        </w:rPr>
+        <w:t>COURT</w:t>
+      </w:r>
+    </w:p>
+    <w:p>
       <w:pPr>
         <w:ind w:right="-136"/>
         <w:rPr>
           <w:b/>
         </w:rPr>
       </w:pPr>
-    </w:p>
-    <w:p ns2:paraId="164D2312" ns2:textId="77777777">
+      <w:r>
+        <w:rPr>
+          <w:b/>
+        </w:rPr>
+        <w:t>HELD AT {{court_location}}</w:t>
+      </w:r>
+    </w:p>
+    <w:p>
       <w:pPr>
         <w:ind w:right="-136"/>
         <w:rPr>
           <w:b/>
-        </w:rPr>
-      </w:pPr>
-      <w:r>
-        <w:rPr>
-          <w:b/>
-        </w:rPr>
-        <w:t xml:space="preserve">IN THE </w:t>
-      </w:r>
-      <w:r>
-        <w:rPr>
-          <w:rFonts w:cs="Arial"/>
-          <w:b/>
-        </w:rPr>
-        <w:t xml:space="preserve">FAMILY </w:t>
-      </w:r>
-      <w:r>
-        <w:rPr>
-          <w:b/>
-        </w:rPr>
-        <w:t>COURT</w:t>
-      </w:r>
-    </w:p>
-    <w:p ns2:paraId="284722DC" ns2:textId="1BA925C4">
+          <w:lang w:val="pt-BR"/>
+        </w:rPr>
+      </w:pPr>
+    </w:p>
+    <w:p>
       <w:pPr>
         <w:ind w:right="-136"/>
         <w:rPr>
-          <w:b/>
-        </w:rPr>
-      </w:pPr>
-      <w:r>
-        <w:rPr>
-          <w:b/>
-        </w:rPr>
-        <w:t>HELD AT {{court_location}}</w:t>
-      </w:r>
-      <w:r>
-        <w:rPr>
-          <w:b/>
-        </w:rPr>
-        <w:t/>
-      </w:r>
-      <w:r>
-        <w:rPr>
-          <w:b/>
-        </w:rPr>
-        <w:t> COURT</w:t>
-      </w:r>
-    </w:p>
-    <w:p ns2:paraId="4C112A0A" ns2:textId="77777777">
-      <w:pPr>
-        <w:ind w:right="-136"/>
-        <w:rPr>
-          <w:b/>
-          <w:lang w:val="pt-BR"/>
-        </w:rPr>
-      </w:pPr>
-    </w:p>
-    <w:p ns2:paraId="49868C7C" ns2:textId="77777777">
-      <w:pPr>
-        <w:ind w:right="-136"/>
-        <w:rPr>
           <w:u w:val="single"/>
           <w:lang w:val="en-GB"/>
         </w:rPr>
       </w:pPr>
     </w:p>
-    <w:p ns2:paraId="49C85C7E" ns2:textId="77777777">
+    <w:p>
       <w:pPr>
         <w:ind w:left="4500" w:right="-136"/>
         <w:rPr>
@@ -165,7 +135,7 @@
         <w:t xml:space="preserve"> NO.</w:t>
       </w:r>
     </w:p>
-    <w:p ns2:paraId="269139BF" ns2:textId="77777777">
+    <w:p>
       <w:pPr>
         <w:ind w:left="2835" w:right="-136"/>
         <w:jc w:val="both"/>
@@ -174,7 +144,7 @@
         </w:rPr>
       </w:pPr>
     </w:p>
-    <w:p ns2:paraId="2C612469" ns2:textId="77777777">
+    <w:p>
       <w:pPr>
         <w:tabs>
           <w:tab w:val="left" w:pos="2880"/>
@@ -185,7 +155,7 @@
         </w:rPr>
       </w:pPr>
     </w:p>
-    <w:p ns2:paraId="25BEA9B0" ns2:textId="77777777">
+    <w:p>
       <w:pPr>
         <w:tabs>
           <w:tab w:val="left" w:pos="2880"/>
@@ -204,13 +174,29 @@
           <w:b/>
           <w:bCs/>
         </w:rPr>
-        <w:t>{{applicant_name}}</w:t>
-      </w:r>
+        <w:t>{{</w:t>
+      </w:r>
+      <w:proofErr w:type="spellStart"/>
       <w:r>
         <w:rPr>
           <w:b/>
           <w:bCs/>
         </w:rPr>
+        <w:t>applicant_name</w:t>
+      </w:r>
+      <w:proofErr w:type="spellEnd"/>
+      <w:r>
+        <w:rPr>
+          <w:b/>
+          <w:bCs/>
+        </w:rPr>
+        <w:t>}}</w:t>
+      </w:r>
+      <w:r>
+        <w:rPr>
+          <w:b/>
+          <w:bCs/>
+        </w:rPr>
         <w:t xml:space="preserve"> </w:t>
       </w:r>
       <w:r>
@@ -272,7 +258,7 @@
         <w:t>}}</w:t>
       </w:r>
     </w:p>
-    <w:p ns2:paraId="1E807ABD" ns2:textId="77777777">
+    <w:p>
       <w:pPr>
         <w:tabs>
           <w:tab w:val="left" w:pos="2880"/>
@@ -281,7 +267,7 @@
         <w:ind w:left="2705" w:right="-136" w:hanging="1985"/>
       </w:pPr>
     </w:p>
-    <w:p ns2:paraId="41F1682C" ns2:textId="77777777">
+    <w:p>
       <w:pPr>
         <w:tabs>
           <w:tab w:val="left" w:pos="2880"/>
@@ -299,7 +285,7 @@
         <w:t>Applicant</w:t>
       </w:r>
     </w:p>
-    <w:p ns2:paraId="65362CB6" ns2:textId="77777777">
+    <w:p>
       <w:pPr>
         <w:tabs>
           <w:tab w:val="left" w:pos="2880"/>
@@ -308,7 +294,7 @@
         <w:ind w:left="720" w:right="-136"/>
       </w:pPr>
     </w:p>
-    <w:p ns2:paraId="6A5E1BF4" ns2:textId="77777777">
+    <w:p>
       <w:pPr>
         <w:tabs>
           <w:tab w:val="left" w:pos="2880"/>
@@ -330,7 +316,23 @@
           <w:rFonts w:cs="Arial"/>
           <w:b/>
         </w:rPr>
-        <w:t>{{respondent_name}}</w:t>
+        <w:t>{{</w:t>
+      </w:r>
+      <w:proofErr w:type="spellStart"/>
+      <w:r>
+        <w:rPr>
+          <w:rFonts w:cs="Arial"/>
+          <w:b/>
+        </w:rPr>
+        <w:t>respondent_name</w:t>
+      </w:r>
+      <w:proofErr w:type="spellEnd"/>
+      <w:r>
+        <w:rPr>
+          <w:rFonts w:cs="Arial"/>
+          <w:b/>
+        </w:rPr>
+        <w:t>}}</w:t>
       </w:r>
       <w:r>
         <w:t xml:space="preserve"> </w:t>
@@ -389,7 +391,7 @@
         <w:t>}}</w:t>
       </w:r>
     </w:p>
-    <w:p ns2:paraId="376357AD" ns2:textId="77777777">
+    <w:p>
       <w:pPr>
         <w:tabs>
           <w:tab w:val="left" w:pos="2880"/>
@@ -397,7 +399,7 @@
         <w:ind w:left="2880" w:right="-136" w:hanging="2160"/>
       </w:pPr>
     </w:p>
-    <w:p ns2:paraId="7927613C" ns2:textId="77777777">
+    <w:p>
       <w:pPr>
         <w:tabs>
           <w:tab w:val="left" w:pos="2880"/>
@@ -415,7 +417,7 @@
         <w:t>Respondent</w:t>
       </w:r>
     </w:p>
-    <w:p ns2:paraId="76CA2F62" ns2:textId="77777777">
+    <w:p>
       <w:pPr>
         <w:tabs>
           <w:tab w:val="left" w:pos="2835"/>
@@ -429,7 +431,7 @@
         </w:rPr>
       </w:pPr>
     </w:p>
-    <w:p ns2:paraId="4588B4B8" ns2:textId="77777777">
+    <w:p>
       <w:pPr>
         <w:ind w:right="-136"/>
         <w:rPr>
@@ -508,7 +510,7 @@
         <w:tab/>
       </w:r>
     </w:p>
-    <w:p ns2:paraId="2889C2E6" ns2:textId="77777777">
+    <w:p>
       <w:pPr>
         <w:ind w:right="-136"/>
         <w:rPr>
@@ -517,7 +519,7 @@
         </w:rPr>
       </w:pPr>
     </w:p>
-    <w:p ns2:paraId="4806B30B" ns2:textId="4D875B3F">
+    <w:p>
       <w:pPr>
         <w:spacing w:line="240" w:lineRule="atLeast"/>
         <w:ind w:right="-136"/>
@@ -539,17 +541,10 @@
           <w:b/>
           <w:lang w:val="en-GB"/>
         </w:rPr>
-        <w:t xml:space="preserve">WITHOUT NOTICE APPLICATION FOR </w:t>
-      </w:r>
-      <w:r>
-        <w:rPr>
-          <w:b/>
-          <w:lang w:val="en-GB"/>
-        </w:rPr>
-        <w:t>PROTECTION ORDER</w:t>
-      </w:r>
-    </w:p>
-    <w:p ns2:paraId="440F7D65" ns2:textId="77777777">
+        <w:t>{{applications}}</w:t>
+      </w:r>
+    </w:p>
+    <w:p>
       <w:pPr>
         <w:spacing w:line="240" w:lineRule="atLeast"/>
         <w:ind w:right="-136"/>
@@ -560,7 +555,7 @@
         </w:rPr>
       </w:pPr>
     </w:p>
-    <w:p ns2:paraId="214A61B6" ns2:textId="77777777">
+    <w:p>
       <w:pPr>
         <w:spacing w:line="240" w:lineRule="atLeast"/>
         <w:ind w:right="-136"/>
@@ -571,7 +566,7 @@
         </w:rPr>
       </w:pPr>
     </w:p>
-    <w:p ns2:paraId="3D934AAD" ns2:textId="44D5E75F">
+    <w:p>
       <w:pPr>
         <w:spacing w:line="240" w:lineRule="atLeast"/>
         <w:ind w:right="17"/>
@@ -586,33 +581,26 @@
           <w:b/>
           <w:i/>
         </w:rPr>
-        <w:t>(</w:t>
-      </w:r>
-      <w:r>
-        <w:rPr>
-          <w:b/>
-          <w:bCs/>
+        <w:t>{{</w:t>
+      </w:r>
+      <w:proofErr w:type="spellStart"/>
+      <w:r>
+        <w:rPr>
+          <w:b/>
           <w:i/>
-          <w:iCs/>
-        </w:rPr>
-        <w:t>Family Violence Act 2018 Sections 60 and 75</w:t>
-      </w:r>
+        </w:rPr>
+        <w:t>relevant_legisaltion</w:t>
+      </w:r>
+      <w:proofErr w:type="spellEnd"/>
       <w:r>
         <w:rPr>
           <w:b/>
           <w:i/>
         </w:rPr>
-        <w:t xml:space="preserve">) </w:t>
-      </w:r>
-      <w:r>
-        <w:rPr>
-          <w:b/>
-          <w:i/>
-        </w:rPr>
-        <w:t xml:space="preserve"> </w:t>
-      </w:r>
-    </w:p>
-    <w:p ns2:paraId="56A4943B" ns2:textId="77777777">
+        <w:t>}}</w:t>
+      </w:r>
+    </w:p>
+    <w:p>
       <w:pPr>
         <w:spacing w:line="240" w:lineRule="atLeast"/>
         <w:ind w:right="17"/>
@@ -623,7 +611,7 @@
         </w:rPr>
       </w:pPr>
     </w:p>
-    <w:p ns2:paraId="02D77CEB" ns2:textId="77777777">
+    <w:p>
       <w:pPr>
         <w:spacing w:line="240" w:lineRule="atLeast"/>
         <w:ind w:right="17"/>
@@ -634,7 +622,7 @@
         </w:rPr>
       </w:pPr>
     </w:p>
-    <w:p ns2:paraId="1FE002EA" ns2:textId="77777777">
+    <w:p>
       <w:pPr>
         <w:spacing w:line="240" w:lineRule="atLeast"/>
         <w:ind w:right="17"/>
@@ -644,7 +632,7 @@
         </w:rPr>
       </w:pPr>
     </w:p>
-    <w:p ns2:paraId="6FDC7FAF" ns2:textId="7D975C20">
+    <w:p>
       <w:pPr>
         <w:spacing w:line="240" w:lineRule="atLeast"/>
         <w:ind w:right="17"/>
@@ -657,47 +645,8 @@
         </w:rPr>
         <w:t>Affirmed this {{month_day}} day of {{month}} {{year}}</w:t>
       </w:r>
-      <w:r>
-        <w:rPr>
-          <w:b/>
-          <w:lang w:val="en-GB"/>
-        </w:rPr>
-        <w:t xml:space="preserve"/>
-      </w:r>
-      <w:r>
-        <w:rPr>
-          <w:rFonts w:cs="Arial"/>
-        </w:rPr>
-        <w:t/>
-      </w:r>
-      <w:proofErr w:type="spellStart"/>
-      <w:r>
-        <w:rPr>
-          <w:rFonts w:cs="Arial"/>
-        </w:rPr>
-        <w:t/>
-      </w:r>
-      <w:proofErr w:type="spellEnd"/>
-      <w:r>
-        <w:rPr>
-          <w:rFonts w:cs="Arial"/>
-        </w:rPr>
-        <w:t/>
-      </w:r>
-      <w:r>
-        <w:rPr>
-          <w:rFonts w:cs="Arial"/>
-        </w:rPr>
-        <w:t xml:space="preserve"/>
-      </w:r>
-      <w:r>
-        <w:rPr>
-          <w:rFonts w:cs="Arial"/>
-        </w:rPr>
-        <w:t/>
-      </w:r>
-    </w:p>
-    <w:p ns2:paraId="791B41A6" ns2:textId="77777777">
+    </w:p>
+    <w:p>
       <w:pPr>
         <w:spacing w:line="240" w:lineRule="atLeast"/>
         <w:ind w:right="-136"/>
@@ -708,7 +657,7 @@
         </w:rPr>
       </w:pPr>
     </w:p>
-    <w:p ns2:paraId="25B27EDC" ns2:textId="77777777">
+    <w:p>
       <w:pPr>
         <w:spacing w:line="240" w:lineRule="atLeast"/>
         <w:ind w:right="-136"/>
@@ -794,7 +743,7 @@
         <w:tab/>
       </w:r>
     </w:p>
-    <w:p ns2:paraId="4BB973A5" ns2:textId="77777777">
+    <w:p>
       <w:pPr>
         <w:spacing w:line="240" w:lineRule="atLeast"/>
         <w:ind w:right="-136"/>
@@ -805,7 +754,7 @@
         </w:rPr>
       </w:pPr>
     </w:p>
-    <w:p ns2:paraId="249663D9" ns2:textId="77777777">
+    <w:p>
       <w:pPr>
         <w:spacing w:line="240" w:lineRule="atLeast"/>
         <w:ind w:right="-136"/>
@@ -816,7 +765,7 @@
         </w:rPr>
       </w:pPr>
     </w:p>
-    <w:p ns2:paraId="38814CAE" ns2:textId="77777777">
+    <w:p>
       <w:pPr>
         <w:spacing w:line="240" w:lineRule="atLeast"/>
         <w:ind w:right="-136"/>
@@ -827,7 +776,7 @@
         </w:rPr>
       </w:pPr>
     </w:p>
-    <w:p ns2:paraId="536788AD" ns2:textId="77777777">
+    <w:p>
       <w:pPr>
         <w:spacing w:line="240" w:lineRule="atLeast"/>
         <w:ind w:right="-136"/>
@@ -838,7 +787,7 @@
         </w:rPr>
       </w:pPr>
     </w:p>
-    <w:p ns2:paraId="45F32A0B" ns2:textId="77777777">
+    <w:p>
       <w:pPr>
         <w:spacing w:line="240" w:lineRule="atLeast"/>
         <w:ind w:right="-136"/>
@@ -849,7 +798,7 @@
         </w:rPr>
       </w:pPr>
     </w:p>
-    <w:p ns2:paraId="1CA0AFA1" ns2:textId="77777777">
+    <w:p>
       <w:pPr>
         <w:spacing w:line="240" w:lineRule="atLeast"/>
         <w:ind w:right="-136"/>
@@ -935,7 +884,7 @@
         <w:tab/>
       </w:r>
     </w:p>
-    <w:p ns2:paraId="5B7E7FD7" ns2:textId="77777777">
+    <w:p>
       <w:pPr>
         <w:spacing w:line="240" w:lineRule="atLeast"/>
         <w:ind w:right="-136"/>
@@ -946,7 +895,7 @@
         </w:rPr>
       </w:pPr>
     </w:p>
-    <w:p ns2:paraId="578BA297" ns2:textId="77777777">
+    <w:p>
       <w:pPr>
         <w:pStyle w:val="BodyText2"/>
         <w:spacing w:line="240" w:lineRule="auto"/>
@@ -979,7 +928,7 @@
         <w:t xml:space="preserve">.  </w:t>
       </w:r>
     </w:p>
-    <w:p ns2:paraId="22E96E19" ns2:textId="77777777">
+    <w:p>
       <w:pPr>
         <w:pStyle w:val="BodyText2"/>
         <w:spacing w:line="240" w:lineRule="auto"/>
@@ -988,13 +937,13 @@
         <w:t>Documents for service may be left at the address for service or may be:</w:t>
       </w:r>
     </w:p>
-    <w:p ns2:paraId="7031767E" ns2:textId="77777777">
+    <w:p>
       <w:pPr>
         <w:pStyle w:val="BodyText2"/>
         <w:spacing w:line="240" w:lineRule="auto"/>
       </w:pPr>
     </w:p>
-    <w:p ns2:paraId="349BAF91" ns2:textId="206C980B">
+    <w:p>
       <w:r>
         <w:t>(a)</w:t>
       </w:r>
@@ -1006,7 +955,7 @@
         <w:t>1</w:t>
       </w:r>
     </w:p>
-    <w:p ns2:paraId="53AB27D0" ns2:textId="77777777">
+    <w:p>
       <w:pPr>
         <w:spacing w:line="240" w:lineRule="atLeast"/>
         <w:ind w:right="-136"/>
@@ -1017,14 +966,14 @@
         </w:rPr>
       </w:pPr>
     </w:p>
-    <w:p ns2:paraId="400FF9A6" ns2:textId="77777777">
+    <w:p>
       <w:pPr>
         <w:spacing w:line="360" w:lineRule="auto"/>
         <w:rPr>
           <w:lang w:val="en-GB"/>
         </w:rPr>
         <w:sectPr>
-          <w:footerReference w:type="default" ns3:id="rId8"/>
+          <w:footerReference w:type="default" r:id="rId8"/>
           <w:pgSz w:w="11906" w:h="16838"/>
           <w:pgMar w:top="1701" w:right="2835" w:bottom="1440" w:left="1701" w:header="709" w:footer="709" w:gutter="0"/>
           <w:cols w:space="720"/>
@@ -1033,7 +982,7 @@
         </w:sectPr>
       </w:pPr>
     </w:p>
-    <w:p ns2:paraId="3FE91B37" ns2:textId="77777777">
+    <w:p>
       <w:pPr>
         <w:spacing w:line="360" w:lineRule="auto"/>
         <w:jc w:val="both"/>
@@ -1045,7 +994,7 @@
         </w:rPr>
       </w:pPr>
     </w:p>
-    <w:p ns2:paraId="6CC5D283" ns2:textId="77777777">
+    <w:p>
       <w:pPr>
         <w:spacing w:line="360" w:lineRule="auto"/>
         <w:jc w:val="both"/>
@@ -1069,7 +1018,25 @@
           <w:b/>
           <w:lang w:val="en-GB"/>
         </w:rPr>
-        <w:t>{{applicant_name}}</w:t>
+        <w:t>{{</w:t>
+      </w:r>
+      <w:proofErr w:type="spellStart"/>
+      <w:r>
+        <w:rPr>
+          <w:rFonts w:cs="Arial"/>
+          <w:b/>
+          <w:lang w:val="en-GB"/>
+        </w:rPr>
+        <w:t>applicant_name</w:t>
+      </w:r>
+      <w:proofErr w:type="spellEnd"/>
+      <w:r>
+        <w:rPr>
+          <w:rFonts w:cs="Arial"/>
+          <w:b/>
+          <w:lang w:val="en-GB"/>
+        </w:rPr>
+        <w:t>}}</w:t>
       </w:r>
       <w:r>
         <w:rPr>
@@ -1077,19 +1044,28 @@
           <w:bCs/>
           <w:lang w:val="en-GB"/>
         </w:rPr>
-        <w:t xml:space="preserve"> of {{applicant_home_address}} affirm,</w:t>
-      </w:r>
-    </w:p>
-    <w:p ns2:paraId="7C29DB01" ns2:textId="77777777">
-      <w:pPr>
-        <w:pStyle w:val="StyleArialJustifiedLinespacing15lines"/>
-        <w:rPr>
-          <w:szCs w:val="24"/>
-          <w:lang w:val="en-GB"/>
-        </w:rPr>
-      </w:pPr>
-    </w:p>
-    <w:p ns2:paraId="28D7DF11" ns2:textId="77777777">
+        <w:t xml:space="preserve"> of {{</w:t>
+      </w:r>
+      <w:proofErr w:type="spellStart"/>
+      <w:r>
+        <w:rPr>
+          <w:rFonts w:cs="Arial"/>
+          <w:bCs/>
+          <w:lang w:val="en-GB"/>
+        </w:rPr>
+        <w:t>applicant_home_address</w:t>
+      </w:r>
+      <w:proofErr w:type="spellEnd"/>
+      <w:r>
+        <w:rPr>
+          <w:rFonts w:cs="Arial"/>
+          <w:bCs/>
+          <w:lang w:val="en-GB"/>
+        </w:rPr>
+        <w:t>}} affirm,</w:t>
+      </w:r>
+    </w:p>
+    <w:p>
       <w:pPr>
         <w:pStyle w:val="PSContractLevel3"/>
         <w:rPr>
@@ -1103,7 +1079,7 @@
         <w:t xml:space="preserve">I am the Applicant in these proceedings.  </w:t>
       </w:r>
     </w:p>
-    <w:p ns2:paraId="1A453045" ns2:textId="31128CA3">
+    <w:p>
       <w:pPr>
         <w:pStyle w:val="PSContractLevel3"/>
         <w:rPr>
@@ -1124,7 +1100,7 @@
         <w:t>(“the Respondent”).</w:t>
       </w:r>
     </w:p>
-    <w:p ns2:paraId="6B5976F1" ns2:textId="77777777">
+    <w:p>
       <w:pPr>
         <w:pStyle w:val="PSContractLevel3"/>
         <w:rPr>
@@ -1138,7 +1114,7 @@
         <w:t>I was in a family relationship with the Respondent.  The nature of my family relationship with the Respondent was as follows:</w:t>
       </w:r>
     </w:p>
-    <w:p ns2:paraId="6234FE60" ns2:textId="77777777">
+    <w:p>
       <w:pPr>
         <w:pStyle w:val="PSContractLevel3"/>
         <w:rPr>
@@ -1152,7 +1128,7 @@
         <w:t>I was in a family relationship with the Respondent.  The nature of my family relationship with the Respondent was as follows:</w:t>
       </w:r>
     </w:p>
-    <w:p ns2:paraId="260F8843" ns2:textId="77777777">
+    <w:p>
       <w:pPr>
         <w:pStyle w:val="PSContractLevel3"/>
         <w:numPr>
@@ -1195,7 +1171,7 @@
         <w:t xml:space="preserve">}}.  </w:t>
       </w:r>
     </w:p>
-    <w:p ns2:paraId="3CEB2E95" ns2:textId="77777777">
+    <w:p>
       <w:pPr>
         <w:pStyle w:val="PSContractLevel3"/>
         <w:numPr>
@@ -1232,15 +1208,47 @@
         <w:t>}}.</w:t>
       </w:r>
     </w:p>
-    <w:p ns2:paraId="5DBE672E" ns2:textId="77777777">
-      <w:pPr>
-        <w:rPr>
-          <w:b/>
-          <w:lang w:val="en-GB"/>
-        </w:rPr>
-      </w:pPr>
-    </w:p>
-    <w:p ns2:paraId="6C892FEB" ns2:textId="77777777">
+    <w:p>
+      <w:pPr>
+        <w:pStyle w:val="PSContractLevel3"/>
+        <w:tabs>
+          <w:tab w:val="clear" w:pos="720"/>
+          <w:tab w:val="num" w:pos="1418"/>
+        </w:tabs>
+        <w:rPr>
+          <w:lang w:val="en-GB"/>
+        </w:rPr>
+      </w:pPr>
+      <w:r>
+        <w:rPr>
+          <w:lang w:val="en-GB"/>
+        </w:rPr>
+        <w:t>{{</w:t>
+      </w:r>
+      <w:proofErr w:type="spellStart"/>
+      <w:r>
+        <w:rPr>
+          <w:lang w:val="en-GB"/>
+        </w:rPr>
+        <w:t>Children_blurb</w:t>
+      </w:r>
+      <w:proofErr w:type="spellEnd"/>
+      <w:r>
+        <w:rPr>
+          <w:lang w:val="en-GB"/>
+        </w:rPr>
+        <w:t>}}</w:t>
+      </w:r>
+    </w:p>
+    <w:p>
+      <w:pPr>
+        <w:rPr>
+          <w:b/>
+          <w:lang w:val="en-GB"/>
+        </w:rPr>
+      </w:pPr>
+    </w:p>
+    <w:p>
       <w:pPr>
         <w:pStyle w:val="PSContractLevel3"/>
         <w:numPr>
@@ -1263,7 +1271,7 @@
         <w:t xml:space="preserve">Facts relating to Respondent </w:t>
       </w:r>
     </w:p>
-    <w:p ns2:paraId="66002CE6" ns2:textId="77777777">
+    <w:p>
       <w:pPr>
         <w:pStyle w:val="PSContractLevel3"/>
         <w:rPr>
@@ -1289,7 +1297,7 @@
         <w:t xml:space="preserve"> violence against me as follows:</w:t>
       </w:r>
     </w:p>
-    <w:p ns2:paraId="10E1B477" ns2:textId="2C3A0DF6">
+    <w:p>
       <w:pPr>
         <w:pStyle w:val="PSContractLevel3"/>
         <w:numPr>
@@ -1304,7 +1312,7 @@
         <w:t>Psychological abuse</w:t>
       </w:r>
     </w:p>
-    <w:p ns2:paraId="418D9A41" ns2:textId="41AD6133">
+    <w:p>
       <w:pPr>
         <w:pStyle w:val="PSContractLevel3"/>
         <w:numPr>
@@ -1319,7 +1327,7 @@
         <w:t>Physical abuse</w:t>
       </w:r>
     </w:p>
-    <w:p ns2:paraId="1FABF430" ns2:textId="5132718B">
+    <w:p>
       <w:pPr>
         <w:pStyle w:val="PSContractLevel3"/>
         <w:numPr>
@@ -1337,7 +1345,7 @@
         <w:t>Financial abuse</w:t>
       </w:r>
     </w:p>
-    <w:p ns2:paraId="3DD4E211" ns2:textId="77777777">
+    <w:p>
       <w:pPr>
         <w:pStyle w:val="PSContractLevel3"/>
         <w:numPr>
@@ -1374,7 +1382,7 @@
         <w:t>Violence</w:t>
       </w:r>
     </w:p>
-    <w:p ns2:paraId="2AF17FCB" ns2:textId="2B75E038">
+    <w:p>
       <w:pPr>
         <w:pStyle w:val="PSContractLevel3"/>
         <w:rPr>
@@ -1388,7 +1396,7 @@
         <w:t>Insert here</w:t>
       </w:r>
     </w:p>
-    <w:p ns2:paraId="0DC04B84" ns2:textId="77777777">
+    <w:p>
       <w:pPr>
         <w:pStyle w:val="PSContractLevel3"/>
         <w:numPr>
@@ -1408,7 +1416,7 @@
         <w:t>Recent Events</w:t>
       </w:r>
     </w:p>
-    <w:p ns2:paraId="251DC658" ns2:textId="76694318">
+    <w:p>
       <w:pPr>
         <w:pStyle w:val="PSContractLevel3"/>
         <w:rPr>
@@ -1424,7 +1432,7 @@
         <w:t>Insert here</w:t>
       </w:r>
     </w:p>
-    <w:p ns2:paraId="024EEB13" ns2:textId="77777777">
+    <w:p>
       <w:pPr>
         <w:pStyle w:val="PSContractLevel3"/>
         <w:numPr>
@@ -1446,7 +1454,7 @@
         <w:t>DISCLOSURE</w:t>
       </w:r>
     </w:p>
-    <w:p ns2:paraId="289CE7DC" ns2:textId="77777777">
+    <w:p>
       <w:pPr>
         <w:pStyle w:val="PSContractLevel3"/>
         <w:rPr>
@@ -1458,7 +1466,7 @@
         <w:t>My lawyer has advised me that when making a without notice Application I must disclose everything relevant to the Application whether it is advantageous to me or not. I have disclosed everything that I consider relevant in my affidavit.</w:t>
       </w:r>
     </w:p>
-    <w:p ns2:paraId="26779FFE" ns2:textId="77777777">
+    <w:p>
       <w:pPr>
         <w:pStyle w:val="PSContractLevel3"/>
         <w:numPr>
@@ -1479,7 +1487,7 @@
         <w:t>Effects on Me</w:t>
       </w:r>
     </w:p>
-    <w:p ns2:paraId="56419F2D" ns2:textId="77777777">
+    <w:p>
       <w:pPr>
         <w:pStyle w:val="PSContractLevel3"/>
       </w:pPr>
@@ -1487,7 +1495,7 @@
         <w:t>I have endured enough of the Respondent’s abuse and violent conduct. I am mentally, emotionally, and physically exhausted. I simply want to be safe in my own home and to live free from fear. I respectfully request that the Respondent be prohibited from coming near me, so that I can begin to rebuild my life in safety and peace.</w:t>
       </w:r>
     </w:p>
-    <w:p ns2:paraId="2E845B43" ns2:textId="77777777">
+    <w:p>
       <w:pPr>
         <w:rPr>
           <w:rFonts w:cs="Arial"/>
@@ -1499,8 +1507,14 @@
         </w:rPr>
       </w:pPr>
     </w:p>
-    <w:p ns2:paraId="26ADF1FB" ns2:textId="77777777">
-      <w:pPr>
+    <w:p>
+      <w:pPr>
+        <w:rPr>
+          <w:b/>
+          <w:lang w:val="en-GB"/>
+        </w:rPr>
+      </w:pPr>
+      <w:r>
         <w:rPr>
           <w:rFonts w:cs="Arial"/>
           <w:b/>
@@ -1509,24 +1523,6 @@
           <w:spacing w:val="-3"/>
           <w:lang w:val="en-GB"/>
         </w:rPr>
-      </w:pPr>
-    </w:p>
-    <w:p ns2:paraId="7A28FF73" ns2:textId="77777777">
-      <w:pPr>
-        <w:rPr>
-          <w:b/>
-          <w:lang w:val="en-GB"/>
-        </w:rPr>
-      </w:pPr>
-      <w:r>
-        <w:rPr>
-          <w:rFonts w:cs="Arial"/>
-          <w:b/>
-          <w:bCs/>
-          <w:caps/>
-          <w:spacing w:val="-3"/>
-          <w:lang w:val="en-GB"/>
-        </w:rPr>
         <w:t>FIREARMS</w:t>
       </w:r>
       <w:r>
@@ -1537,15 +1533,15 @@
         <w:t xml:space="preserve"> </w:t>
       </w:r>
     </w:p>
-    <w:p ns2:paraId="11DCD3BE" ns2:textId="77777777">
-      <w:pPr>
-        <w:rPr>
-          <w:b/>
-          <w:lang w:val="en-GB"/>
-        </w:rPr>
-      </w:pPr>
-    </w:p>
-    <w:p ns2:paraId="5FB3E854" ns2:textId="77777777">
+    <w:p>
+      <w:pPr>
+        <w:rPr>
+          <w:b/>
+          <w:lang w:val="en-GB"/>
+        </w:rPr>
+      </w:pPr>
+    </w:p>
+    <w:p>
       <w:pPr>
         <w:pStyle w:val="PSContractLevel3"/>
         <w:rPr>
@@ -1560,7 +1556,7 @@
         <w:t>To the best of my knowledge, the Respondent does not:</w:t>
       </w:r>
     </w:p>
-    <w:p ns2:paraId="13E4C339" ns2:textId="77777777">
+    <w:p>
       <w:pPr>
         <w:pStyle w:val="PSContractLevel3"/>
         <w:numPr>
@@ -1578,7 +1574,7 @@
         <w:t>Hold a firearms licence; or</w:t>
       </w:r>
     </w:p>
-    <w:p ns2:paraId="4A2219FA" ns2:textId="77777777">
+    <w:p>
       <w:pPr>
         <w:pStyle w:val="PSContractLevel3"/>
         <w:numPr>
@@ -1609,131 +1605,939 @@
         <w:t>).</w:t>
       </w:r>
     </w:p>
-    <w:p ns2:paraId="342D17BE" ns2:textId="77777777">
+    <w:p>
       <w:pPr>
         <w:rPr>
           <w:b/>
           <w:caps/>
-          <w:lang w:val="en-GB"/>
-        </w:rPr>
-      </w:pPr>
+          <w:sz w:val="23"/>
+          <w:szCs w:val="23"/>
+          <w:lang w:val="en-GB"/>
+        </w:rPr>
+      </w:pPr>
+      <w:bookmarkStart w:id="0" w:name="OLE_LINK1"/>
+      <w:bookmarkStart w:id="1" w:name="OLE_LINK4"/>
       <w:r>
         <w:rPr>
           <w:b/>
           <w:caps/>
-          <w:lang w:val="en-GB"/>
-        </w:rPr>
-        <w:t>FACTS IN SUPPORT OF APPLICATION FOR PROTECTION ORDER WITHOUT NOTICE</w:t>
-      </w:r>
-    </w:p>
-    <w:p ns2:paraId="40F496A3" ns2:textId="77777777">
-      <w:pPr>
-        <w:rPr>
-          <w:lang w:val="en-GB"/>
-        </w:rPr>
-      </w:pPr>
-    </w:p>
-    <w:p ns2:paraId="0243B10D" ns2:textId="77777777">
+          <w:sz w:val="23"/>
+          <w:szCs w:val="23"/>
+          <w:lang w:val="en-GB"/>
+        </w:rPr>
+        <w:t xml:space="preserve">Facts in </w:t>
+      </w:r>
+      <w:r>
+        <w:rPr>
+          <w:rFonts w:cs="Arial"/>
+          <w:b/>
+          <w:bCs/>
+          <w:caps/>
+          <w:spacing w:val="-3"/>
+          <w:sz w:val="23"/>
+          <w:szCs w:val="23"/>
+          <w:lang w:val="en-GB"/>
+        </w:rPr>
+        <w:t>Support</w:t>
+      </w:r>
+      <w:r>
+        <w:rPr>
+          <w:b/>
+          <w:caps/>
+          <w:sz w:val="23"/>
+          <w:szCs w:val="23"/>
+          <w:lang w:val="en-GB"/>
+        </w:rPr>
+        <w:t xml:space="preserve"> of Application for Protection Order Without Notice</w:t>
+      </w:r>
+    </w:p>
+    <w:p>
+      <w:pPr>
+        <w:rPr>
+          <w:sz w:val="23"/>
+          <w:szCs w:val="23"/>
+          <w:lang w:val="en-GB"/>
+        </w:rPr>
+      </w:pPr>
+    </w:p>
+    <w:p>
       <w:pPr>
         <w:pStyle w:val="PSContractLevel3"/>
         <w:rPr>
-          <w:lang w:val="en-GB"/>
-        </w:rPr>
-      </w:pPr>
-      <w:r>
-        <w:rPr>
-          <w:lang w:val="en-GB"/>
-        </w:rPr>
-        <w:t>The Application for a Protection Order is being made without notice to the Respondent because the delay that would be caused by proceeding on notice would or might entail a risk of harm and undue hardship to me as follows:</w:t>
-      </w:r>
-    </w:p>
-    <w:p ns2:paraId="79EBFE49" ns2:textId="77777777">
+          <w:sz w:val="23"/>
+          <w:szCs w:val="23"/>
+          <w:lang w:val="en-GB"/>
+        </w:rPr>
+      </w:pPr>
+      <w:r>
+        <w:t>The Application for a Protection Order is being made without notice to the Respondent because the delay that would be caused by proceeding on notice would or might entail a risk of harm and undue hardship to me{{</w:t>
+      </w:r>
+      <w:proofErr w:type="spellStart"/>
+      <w:r>
+        <w:t>children_harm_reference</w:t>
+      </w:r>
+      <w:proofErr w:type="spellEnd"/>
+      <w:r>
+        <w:t>}} as follows:</w:t>
+      </w:r>
+    </w:p>
+    <w:p>
+      <w:pPr>
+        <w:pStyle w:val="PSContractLevel3"/>
+        <w:rPr>
+          <w:rFonts w:ascii="Times New Roman" w:hAnsi="Times New Roman"/>
+          <w:lang w:val="en-NZ" w:eastAsia="en-GB"/>
+        </w:rPr>
+      </w:pPr>
+      <w:r>
+        <w:t xml:space="preserve">I believe that if the Respondent knew that I was applying for this Order, I may suffer further </w:t>
+      </w:r>
+      <w:r>
+        <w:t>abuse</w:t>
+      </w:r>
+      <w:r>
+        <w:t>.</w:t>
+      </w:r>
+    </w:p>
+    <w:p>
       <w:pPr>
         <w:pStyle w:val="PSContractLevel3"/>
         <w:numPr>
           <w:ilvl w:val="0"/>
-          <w:numId w:val="6"/>
+          <w:numId w:val="0"/>
         </w:numPr>
-        <w:rPr>
-          <w:lang w:val="en-GB"/>
-        </w:rPr>
-      </w:pPr>
-      <w:r>
-        <w:rPr>
-          <w:lang w:val="en-GB"/>
-        </w:rPr>
-        <w:t>I am very fearful for my safety.</w:t>
-      </w:r>
-    </w:p>
-    <w:p ns2:paraId="12647D71" ns2:textId="6846EAF4">
+        <w:ind w:left="720" w:hanging="720"/>
+        <w:rPr>
+          <w:b/>
+          <w:bCs/>
+          <w:sz w:val="23"/>
+          <w:szCs w:val="23"/>
+          <w:lang w:val="en-GB"/>
+        </w:rPr>
+      </w:pPr>
+      <w:r>
+        <w:rPr>
+          <w:b/>
+          <w:bCs/>
+          <w:sz w:val="23"/>
+          <w:szCs w:val="23"/>
+          <w:lang w:val="en-GB"/>
+        </w:rPr>
+        <w:t xml:space="preserve">FACTS IN SUPPORT OF APPLICATION FOR A TENANCY ORDER </w:t>
+      </w:r>
+    </w:p>
+    <w:p>
+      <w:pPr>
+        <w:pStyle w:val="PSContractLevel3"/>
+        <w:rPr>
+          <w:sz w:val="23"/>
+          <w:szCs w:val="23"/>
+          <w:lang w:val="en-GB"/>
+        </w:rPr>
+      </w:pPr>
+      <w:r>
+        <w:t>{{</w:t>
+      </w:r>
+      <w:proofErr w:type="spellStart"/>
+      <w:r>
+        <w:t>tenancy_protection_reference</w:t>
+      </w:r>
+      <w:proofErr w:type="spellEnd"/>
+      <w:proofErr w:type="gramStart"/>
+      <w:r>
+        <w:t>}}I</w:t>
+      </w:r>
+      <w:proofErr w:type="gramEnd"/>
+      <w:r>
+        <w:t xml:space="preserve"> am also applying for a Tenancy Order granting</w:t>
+      </w:r>
+      <w:r>
+        <w:br/>
+        <w:t>me the right to live at our current dwelling house, {{</w:t>
+      </w:r>
+      <w:proofErr w:type="spellStart"/>
+      <w:r>
+        <w:t>dwelling_address</w:t>
+      </w:r>
+      <w:proofErr w:type="spellEnd"/>
+      <w:r>
+        <w:t>}}.</w:t>
+      </w:r>
+    </w:p>
+    <w:p>
+      <w:pPr>
+        <w:pStyle w:val="PSContractLevel3"/>
+        <w:rPr>
+          <w:sz w:val="23"/>
+          <w:szCs w:val="23"/>
+          <w:lang w:val="en-GB"/>
+        </w:rPr>
+      </w:pPr>
+      <w:r>
+        <w:lastRenderedPageBreak/>
+        <w:t>{{</w:t>
+      </w:r>
+      <w:proofErr w:type="spellStart"/>
+      <w:r>
+        <w:t>tenancy_children_paragraph</w:t>
+      </w:r>
+      <w:proofErr w:type="spellEnd"/>
+      <w:r>
+        <w:t>}}</w:t>
+      </w:r>
+      <w:r>
+        <w:t xml:space="preserve"> </w:t>
+      </w:r>
+      <w:r>
+        <w:rPr>
+          <w:sz w:val="23"/>
+          <w:szCs w:val="23"/>
+          <w:lang w:val="en-GB"/>
+        </w:rPr>
+        <w:t xml:space="preserve">It is in the best interests of </w:t>
+      </w:r>
+      <w:r>
+        <w:rPr>
+          <w:sz w:val="23"/>
+          <w:szCs w:val="23"/>
+          <w:lang w:val="en-GB"/>
+        </w:rPr>
+        <w:t xml:space="preserve">our child </w:t>
+      </w:r>
+      <w:r>
+        <w:rPr>
+          <w:sz w:val="23"/>
+          <w:szCs w:val="23"/>
+          <w:lang w:val="en-GB"/>
+        </w:rPr>
+        <w:t xml:space="preserve">that we remain in the dwelling house given the house is very near to </w:t>
+      </w:r>
+      <w:r>
+        <w:rPr>
+          <w:sz w:val="23"/>
+          <w:szCs w:val="23"/>
+          <w:lang w:val="en-GB"/>
+        </w:rPr>
+        <w:t xml:space="preserve">her </w:t>
+      </w:r>
+      <w:proofErr w:type="spellStart"/>
+      <w:r>
+        <w:rPr>
+          <w:sz w:val="23"/>
+          <w:szCs w:val="23"/>
+          <w:lang w:val="en-GB"/>
+        </w:rPr>
+        <w:t>pre school</w:t>
+      </w:r>
+      <w:proofErr w:type="spellEnd"/>
+      <w:r>
+        <w:rPr>
+          <w:sz w:val="23"/>
+          <w:szCs w:val="23"/>
+          <w:lang w:val="en-GB"/>
+        </w:rPr>
+        <w:t xml:space="preserve"> and friends. I do not want to leave the dwelling house and uproot my child from their </w:t>
+      </w:r>
+      <w:proofErr w:type="spellStart"/>
+      <w:proofErr w:type="gramStart"/>
+      <w:r>
+        <w:rPr>
+          <w:sz w:val="23"/>
+          <w:szCs w:val="23"/>
+          <w:lang w:val="en-GB"/>
+        </w:rPr>
+        <w:t>well established</w:t>
+      </w:r>
+      <w:proofErr w:type="spellEnd"/>
+      <w:proofErr w:type="gramEnd"/>
+      <w:r>
+        <w:rPr>
+          <w:sz w:val="23"/>
+          <w:szCs w:val="23"/>
+          <w:lang w:val="en-GB"/>
+        </w:rPr>
+        <w:t xml:space="preserve"> routines. </w:t>
+      </w:r>
+    </w:p>
+    <w:p>
       <w:pPr>
         <w:pStyle w:val="PSContractLevel3"/>
         <w:numPr>
           <w:ilvl w:val="0"/>
-          <w:numId w:val="6"/>
+          <w:numId w:val="0"/>
         </w:numPr>
         <w:rPr>
-          <w:lang w:val="en-GB"/>
-        </w:rPr>
-      </w:pPr>
-      <w:r>
-        <w:rPr>
-          <w:lang w:val="en-GB"/>
-        </w:rPr>
-        <w:t>I believe that if the Respondent knew that I was applying for this Order, I may suffer further physical abuse and/or psychological abuse.</w:t>
-      </w:r>
-    </w:p>
-    <w:p ns2:paraId="20CE0FBA" ns2:textId="77777777">
-      <w:pPr>
-        <w:rPr>
-          <w:b/>
-          <w:lang w:val="en-GB"/>
-        </w:rPr>
-      </w:pPr>
-      <w:r>
-        <w:rPr>
-          <w:b/>
+          <w:b/>
+          <w:bCs/>
+          <w:sz w:val="23"/>
+          <w:szCs w:val="23"/>
+          <w:lang w:val="en-GB"/>
+        </w:rPr>
+      </w:pPr>
+      <w:r>
+        <w:rPr>
+          <w:b/>
+          <w:bCs/>
+          <w:sz w:val="23"/>
+          <w:szCs w:val="23"/>
+          <w:lang w:val="en-GB"/>
+        </w:rPr>
+        <w:t>F</w:t>
+      </w:r>
+      <w:r>
+        <w:rPr>
+          <w:b/>
+          <w:bCs/>
+          <w:sz w:val="23"/>
+          <w:szCs w:val="23"/>
+          <w:lang w:val="en-GB"/>
+        </w:rPr>
+        <w:t xml:space="preserve">ACTS </w:t>
+      </w:r>
+      <w:r>
+        <w:rPr>
+          <w:b/>
+          <w:bCs/>
+          <w:sz w:val="23"/>
+          <w:szCs w:val="23"/>
+          <w:lang w:val="en-GB"/>
+        </w:rPr>
+        <w:t xml:space="preserve">IN SUPPORT OF APPLICATION FOR A TENANCY ORDER </w:t>
+      </w:r>
+      <w:r>
+        <w:rPr>
+          <w:b/>
+          <w:bCs/>
+          <w:sz w:val="23"/>
+          <w:szCs w:val="23"/>
+          <w:lang w:val="en-GB"/>
+        </w:rPr>
+        <w:t>WITHOUT NOTICE</w:t>
+      </w:r>
+    </w:p>
+    <w:p>
+      <w:pPr>
+        <w:pStyle w:val="PSContractLevel3"/>
+        <w:rPr>
+          <w:sz w:val="23"/>
+          <w:szCs w:val="23"/>
+          <w:lang w:val="en-GB"/>
+        </w:rPr>
+      </w:pPr>
+      <w:r>
+        <w:rPr>
+          <w:sz w:val="23"/>
+          <w:szCs w:val="23"/>
+          <w:lang w:val="en-GB"/>
+        </w:rPr>
+        <w:t>The Application for a Tenancy Order is made Without Notice to the Respondent because:</w:t>
+      </w:r>
+    </w:p>
+    <w:p>
+      <w:pPr>
+        <w:pStyle w:val="PSContractLevel3"/>
+        <w:numPr>
+          <w:ilvl w:val="0"/>
+          <w:numId w:val="18"/>
+        </w:numPr>
+        <w:jc w:val="left"/>
+        <w:rPr>
+          <w:sz w:val="23"/>
+          <w:szCs w:val="23"/>
+          <w:lang w:val="en-GB"/>
+        </w:rPr>
+      </w:pPr>
+      <w:r>
+        <w:t>The</w:t>
+      </w:r>
+      <w:r>
+        <w:t xml:space="preserve"> </w:t>
+      </w:r>
+      <w:r>
+        <w:t>Respondent has subjected me to the abuse described in this affidavit;</w:t>
+      </w:r>
+      <w:r>
+        <w:t xml:space="preserve"> </w:t>
+      </w:r>
+      <w:r>
+        <w:t>and the</w:t>
+      </w:r>
+      <w:r>
+        <w:t xml:space="preserve"> </w:t>
+      </w:r>
+      <w:r>
+        <w:t>delay might expose</w:t>
+      </w:r>
+      <w:r>
+        <w:t xml:space="preserve"> </w:t>
+      </w:r>
+      <w:r>
+        <w:t>me</w:t>
+      </w:r>
+      <w:r>
+        <w:t xml:space="preserve"> </w:t>
+      </w:r>
+      <w:r>
+        <w:t>{{</w:t>
+      </w:r>
+      <w:proofErr w:type="spellStart"/>
+      <w:r>
+        <w:t>children_abuse_reference</w:t>
+      </w:r>
+      <w:proofErr w:type="spellEnd"/>
+      <w:r>
+        <w:t>}}</w:t>
+      </w:r>
+      <w:r>
+        <w:t xml:space="preserve"> </w:t>
+      </w:r>
+      <w:r>
+        <w:t>to further abuse.</w:t>
+      </w:r>
+    </w:p>
+    <w:p>
+      <w:pPr>
+        <w:pStyle w:val="PSContractLevel3"/>
+        <w:numPr>
+          <w:ilvl w:val="0"/>
+          <w:numId w:val="0"/>
+        </w:numPr>
+        <w:ind w:left="720" w:hanging="720"/>
+        <w:rPr>
+          <w:b/>
+          <w:bCs/>
+          <w:sz w:val="23"/>
+          <w:szCs w:val="23"/>
+          <w:lang w:val="en-GB"/>
+        </w:rPr>
+      </w:pPr>
+      <w:r>
+        <w:rPr>
+          <w:b/>
+          <w:bCs/>
+          <w:sz w:val="23"/>
+          <w:szCs w:val="23"/>
+          <w:lang w:val="en-GB"/>
+        </w:rPr>
+        <w:t xml:space="preserve">FACTS IN SUPPORT OF APPLICATION FOR </w:t>
+      </w:r>
+      <w:r>
+        <w:rPr>
+          <w:b/>
+          <w:bCs/>
+          <w:sz w:val="23"/>
+          <w:szCs w:val="23"/>
+          <w:lang w:val="en-GB"/>
+        </w:rPr>
+        <w:t xml:space="preserve">ANCILLARY </w:t>
+      </w:r>
+      <w:r>
+        <w:rPr>
+          <w:b/>
+          <w:bCs/>
+          <w:sz w:val="23"/>
+          <w:szCs w:val="23"/>
+          <w:lang w:val="en-GB"/>
+        </w:rPr>
+        <w:t>FURNITURE ORDER</w:t>
+      </w:r>
+    </w:p>
+    <w:p>
+      <w:pPr>
+        <w:pStyle w:val="PSContractLevel3"/>
+        <w:jc w:val="left"/>
+        <w:rPr>
+          <w:rFonts w:ascii="Times New Roman" w:hAnsi="Times New Roman"/>
+          <w:lang w:val="en-NZ" w:eastAsia="en-GB"/>
+        </w:rPr>
+      </w:pPr>
+      <w:r>
+        <w:t>{{</w:t>
+      </w:r>
+      <w:proofErr w:type="spellStart"/>
+      <w:r>
+        <w:t>furniture_protection_reference</w:t>
+      </w:r>
+      <w:proofErr w:type="spellEnd"/>
+      <w:proofErr w:type="gramStart"/>
+      <w:r>
+        <w:t>}}I</w:t>
+      </w:r>
+      <w:proofErr w:type="gramEnd"/>
+      <w:r>
+        <w:t xml:space="preserve"> am also applying for an Ancillary Furniture Order granting</w:t>
+      </w:r>
+      <w:r>
+        <w:t xml:space="preserve"> </w:t>
+      </w:r>
+      <w:r>
+        <w:t>me the right to possession and use of the furniture and chattels listed below.</w:t>
+      </w:r>
+    </w:p>
+    <w:p>
+      <w:pPr>
+        <w:pStyle w:val="PSContractLevel3"/>
+        <w:numPr>
+          <w:ilvl w:val="0"/>
+          <w:numId w:val="0"/>
+        </w:numPr>
+        <w:ind w:left="720" w:hanging="720"/>
+        <w:rPr>
+          <w:b/>
+          <w:bCs/>
+          <w:sz w:val="23"/>
+          <w:szCs w:val="23"/>
+          <w:lang w:val="en-GB"/>
+        </w:rPr>
+      </w:pPr>
+      <w:r>
+        <w:rPr>
+          <w:b/>
+          <w:bCs/>
+          <w:sz w:val="23"/>
+          <w:szCs w:val="23"/>
+          <w:lang w:val="en-GB"/>
+        </w:rPr>
+        <w:t xml:space="preserve">FACTS IN SUPPORT OF APPLICATION FOR FURNITURE ORDER WITHOUT NOTICE </w:t>
+      </w:r>
+    </w:p>
+    <w:p>
+      <w:pPr>
+        <w:pStyle w:val="PSContractLevel3"/>
+        <w:rPr>
+          <w:bCs/>
+          <w:sz w:val="23"/>
+          <w:szCs w:val="23"/>
+          <w:lang w:val="en-GB"/>
+        </w:rPr>
+      </w:pPr>
+      <w:r>
+        <w:t>{{</w:t>
+      </w:r>
+      <w:proofErr w:type="spellStart"/>
+      <w:r>
+        <w:t>furniture_</w:t>
+      </w:r>
+      <w:r>
+        <w:t>order</w:t>
+      </w:r>
+      <w:r>
+        <w:t>_reference</w:t>
+      </w:r>
+      <w:proofErr w:type="spellEnd"/>
+      <w:r>
+        <w:t>}}</w:t>
+      </w:r>
+    </w:p>
+    <w:p>
+      <w:pPr>
+        <w:pStyle w:val="PSContractLevel3"/>
+        <w:numPr>
+          <w:ilvl w:val="0"/>
+          <w:numId w:val="0"/>
+        </w:numPr>
+        <w:ind w:left="720" w:hanging="720"/>
+        <w:rPr>
+          <w:rFonts w:cs="Arial"/>
+          <w:b/>
+          <w:spacing w:val="-3"/>
+          <w:sz w:val="23"/>
+          <w:szCs w:val="23"/>
+          <w:lang w:val="en-GB"/>
+        </w:rPr>
+      </w:pPr>
+      <w:r>
+        <w:rPr>
+          <w:b/>
+          <w:sz w:val="23"/>
+          <w:szCs w:val="23"/>
+          <w:lang w:val="en-GB"/>
+        </w:rPr>
+        <w:t xml:space="preserve">MY PROPOSAL FOR </w:t>
+      </w:r>
+      <w:proofErr w:type="gramStart"/>
+      <w:r>
+        <w:rPr>
+          <w:b/>
+          <w:sz w:val="23"/>
+          <w:szCs w:val="23"/>
+          <w:lang w:val="en-GB"/>
+        </w:rPr>
+        <w:t>DAY TO DAY</w:t>
+      </w:r>
+      <w:proofErr w:type="gramEnd"/>
+      <w:r>
+        <w:rPr>
+          <w:b/>
+          <w:sz w:val="23"/>
+          <w:szCs w:val="23"/>
+          <w:lang w:val="en-GB"/>
+        </w:rPr>
+        <w:t xml:space="preserve"> CARE AND CONTACT</w:t>
+      </w:r>
+    </w:p>
+    <w:p>
+      <w:pPr>
+        <w:pStyle w:val="PSContractLevel3"/>
+        <w:jc w:val="left"/>
+        <w:rPr>
+          <w:rFonts w:cs="Arial"/>
+          <w:spacing w:val="-3"/>
+          <w:sz w:val="23"/>
+          <w:szCs w:val="23"/>
+          <w:lang w:val="en-GB"/>
+        </w:rPr>
+      </w:pPr>
+      <w:r>
+        <w:t>I seek a Parenting Order granting me</w:t>
+      </w:r>
+      <w:r>
+        <w:t xml:space="preserve"> </w:t>
+      </w:r>
+      <w:r>
+        <w:t>day to day care of {{</w:t>
+      </w:r>
+      <w:proofErr w:type="spellStart"/>
+      <w:r>
+        <w:t>the_child_or_children</w:t>
+      </w:r>
+      <w:proofErr w:type="spellEnd"/>
+      <w:r>
+        <w:t>}}. I have always had a greater role</w:t>
+      </w:r>
+      <w:r>
+        <w:t xml:space="preserve"> </w:t>
+      </w:r>
+      <w:r>
+        <w:t>and</w:t>
+      </w:r>
+      <w:r>
+        <w:br/>
+        <w:t>responsibility in providing day to day care to {{</w:t>
+      </w:r>
+      <w:proofErr w:type="spellStart"/>
+      <w:r>
+        <w:t>the_child_or_children</w:t>
+      </w:r>
+      <w:proofErr w:type="spellEnd"/>
+      <w:r>
+        <w:t>}}. I</w:t>
+      </w:r>
+      <w:r>
+        <w:t xml:space="preserve"> </w:t>
+      </w:r>
+      <w:r>
+        <w:t>want this</w:t>
+      </w:r>
+      <w:r>
+        <w:t xml:space="preserve"> </w:t>
+      </w:r>
+      <w:r>
+        <w:t>arrangement to continue and for {{</w:t>
+      </w:r>
+      <w:proofErr w:type="spellStart"/>
+      <w:r>
+        <w:t>the_child_or_children</w:t>
+      </w:r>
+      <w:proofErr w:type="spellEnd"/>
+      <w:r>
+        <w:t>}} to</w:t>
+      </w:r>
+      <w:r>
+        <w:t xml:space="preserve"> </w:t>
+      </w:r>
+      <w:r>
+        <w:t xml:space="preserve">remain in my </w:t>
+      </w:r>
+      <w:proofErr w:type="gramStart"/>
+      <w:r>
+        <w:t>day to day</w:t>
+      </w:r>
+      <w:proofErr w:type="gramEnd"/>
+      <w:r>
+        <w:t xml:space="preserve"> care.</w:t>
+      </w:r>
+    </w:p>
+    <w:p>
+      <w:pPr>
+        <w:pStyle w:val="PSContractLevel3"/>
+        <w:jc w:val="left"/>
+        <w:rPr>
+          <w:rFonts w:ascii="Times New Roman" w:hAnsi="Times New Roman"/>
+          <w:lang w:val="en-NZ" w:eastAsia="en-GB"/>
+        </w:rPr>
+      </w:pPr>
+      <w:r>
+        <w:t>I seek an interim Parenting Order</w:t>
+      </w:r>
+      <w:r>
+        <w:t xml:space="preserve"> </w:t>
+      </w:r>
+      <w:r>
+        <w:t>granting the Respondent supervised contact with {{</w:t>
+      </w:r>
+      <w:proofErr w:type="spellStart"/>
+      <w:r>
+        <w:t>the_child_or_children</w:t>
+      </w:r>
+      <w:proofErr w:type="spellEnd"/>
+      <w:r>
+        <w:t>}}. I am concerned about</w:t>
+      </w:r>
+      <w:r>
+        <w:t xml:space="preserve"> </w:t>
+      </w:r>
+      <w:r>
+        <w:lastRenderedPageBreak/>
+        <w:t>{{</w:t>
+      </w:r>
+      <w:proofErr w:type="spellStart"/>
+      <w:r>
+        <w:t>the_child_or_children_possessive</w:t>
+      </w:r>
+      <w:proofErr w:type="spellEnd"/>
+      <w:r>
+        <w:t>}} safety in the Respondent’s</w:t>
+      </w:r>
+      <w:r>
+        <w:t xml:space="preserve"> u</w:t>
+      </w:r>
+      <w:r>
+        <w:t>nsupervised care because:</w:t>
+      </w:r>
+    </w:p>
+    <w:p>
+      <w:pPr>
+        <w:pStyle w:val="PSContractLevel3"/>
+        <w:numPr>
+          <w:ilvl w:val="1"/>
+          <w:numId w:val="3"/>
+        </w:numPr>
+        <w:tabs>
+          <w:tab w:val="num" w:pos="1418"/>
+        </w:tabs>
+        <w:rPr>
+          <w:rFonts w:ascii="Times New Roman" w:hAnsi="Times New Roman"/>
+          <w:lang w:val="en-NZ" w:eastAsia="en-GB"/>
+        </w:rPr>
+      </w:pPr>
+      <w:r>
+        <w:t>{{</w:t>
+      </w:r>
+      <w:proofErr w:type="spellStart"/>
+      <w:r>
+        <w:t>parenting_safety_reasons</w:t>
+      </w:r>
+      <w:proofErr w:type="spellEnd"/>
+      <w:r>
+        <w:t>}}</w:t>
+      </w:r>
+      <w:r>
+        <w:rPr>
+          <w:rFonts w:ascii="Times New Roman" w:hAnsi="Times New Roman"/>
+          <w:lang w:val="en-NZ" w:eastAsia="en-GB"/>
+        </w:rPr>
+        <w:t xml:space="preserve"> </w:t>
+      </w:r>
+      <w:r>
+        <w:rPr>
+          <w:rFonts w:cs="Arial"/>
+          <w:spacing w:val="-3"/>
+          <w:sz w:val="23"/>
+          <w:szCs w:val="23"/>
+          <w:lang w:val="en-GB"/>
+        </w:rPr>
+        <w:t xml:space="preserve">I am concerned that the Respondent is unable to control his anger and does not realise that his behaviour is abusive. </w:t>
+      </w:r>
+    </w:p>
+    <w:p>
+      <w:pPr>
+        <w:pStyle w:val="PSContractLevel3"/>
+        <w:numPr>
+          <w:ilvl w:val="1"/>
+          <w:numId w:val="3"/>
+        </w:numPr>
+        <w:tabs>
+          <w:tab w:val="clear" w:pos="720"/>
+          <w:tab w:val="num" w:pos="1418"/>
+        </w:tabs>
+        <w:rPr>
+          <w:rFonts w:cs="Arial"/>
+          <w:spacing w:val="-3"/>
+          <w:sz w:val="23"/>
+          <w:szCs w:val="23"/>
+          <w:lang w:val="en-GB"/>
+        </w:rPr>
+      </w:pPr>
+      <w:r>
+        <w:rPr>
+          <w:sz w:val="23"/>
+          <w:szCs w:val="23"/>
+          <w:lang w:val="en-GB"/>
+        </w:rPr>
+        <w:t xml:space="preserve">I'm concerned about </w:t>
+      </w:r>
+      <w:r>
+        <w:rPr>
+          <w:sz w:val="23"/>
+          <w:szCs w:val="23"/>
+          <w:lang w:val="en-GB"/>
+        </w:rPr>
+        <w:t>the child/ren</w:t>
+      </w:r>
+      <w:r>
+        <w:rPr>
+          <w:sz w:val="23"/>
+          <w:szCs w:val="23"/>
+          <w:lang w:val="en-GB"/>
+        </w:rPr>
+        <w:t xml:space="preserve"> being with him while he's in the mental state of having uncontrollable thoughts and not being able to think clearly.  </w:t>
+      </w:r>
+    </w:p>
+    <w:p>
+      <w:pPr>
+        <w:pStyle w:val="PSContractLevel3"/>
+        <w:rPr>
+          <w:b/>
+          <w:sz w:val="23"/>
+          <w:szCs w:val="23"/>
+          <w:lang w:val="en-GB"/>
+        </w:rPr>
+      </w:pPr>
+      <w:r>
+        <w:rPr>
+          <w:rFonts w:cs="Arial"/>
+          <w:spacing w:val="-3"/>
+          <w:sz w:val="23"/>
+          <w:szCs w:val="23"/>
+          <w:lang w:val="en-GB"/>
+        </w:rPr>
+        <w:t xml:space="preserve">I propose that the contact be supervised by a Professional Contact Provider until he addresses his mental health. </w:t>
+      </w:r>
+    </w:p>
+    <w:bookmarkEnd w:id="1"/>
+    <w:p>
+      <w:pPr>
+        <w:pStyle w:val="PSContractLevel3"/>
+        <w:numPr>
+          <w:ilvl w:val="0"/>
+          <w:numId w:val="0"/>
+        </w:numPr>
+        <w:rPr>
+          <w:b/>
+          <w:sz w:val="23"/>
+          <w:szCs w:val="23"/>
+          <w:lang w:val="en-GB"/>
+        </w:rPr>
+      </w:pPr>
+      <w:r>
+        <w:rPr>
+          <w:b/>
+          <w:sz w:val="23"/>
+          <w:szCs w:val="23"/>
           <w:lang w:val="en-GB"/>
         </w:rPr>
         <w:t xml:space="preserve">ORDERS SOUGHT </w:t>
       </w:r>
     </w:p>
-    <w:p ns2:paraId="1C3E0DFE" ns2:textId="77777777">
-      <w:pPr>
-        <w:rPr>
-          <w:b/>
-          <w:lang w:val="en-GB"/>
-        </w:rPr>
-      </w:pPr>
-    </w:p>
-    <w:p ns2:paraId="55B0A66A" ns2:textId="47D0F233">
+    <w:p>
+      <w:pPr>
+        <w:rPr>
+          <w:b/>
+          <w:sz w:val="23"/>
+          <w:szCs w:val="23"/>
+          <w:lang w:val="en-GB"/>
+        </w:rPr>
+      </w:pPr>
+    </w:p>
+    <w:p>
       <w:pPr>
         <w:pStyle w:val="PSContractLevel3"/>
         <w:rPr>
-          <w:lang w:val="en-GB"/>
-        </w:rPr>
-      </w:pPr>
-      <w:r>
-        <w:rPr>
-          <w:lang w:val="en-GB"/>
-        </w:rPr>
-        <w:lastRenderedPageBreak/>
-        <w:t>I seek a Protection Order against the Responden</w:t>
-      </w:r>
-      <w:r>
-        <w:rPr>
-          <w:lang w:val="en-GB"/>
-        </w:rPr>
-        <w:t xml:space="preserve">t. </w:t>
-      </w:r>
-      <w:r>
-        <w:rPr>
-          <w:lang w:val="en-GB"/>
-        </w:rPr>
-        <w:t>I seek the standard conditions of a Protection Order. I respectfully request that these orders be granted without notice to the Respondent.</w:t>
-      </w:r>
-    </w:p>
-    <w:p ns2:paraId="45D51CF1" ns2:textId="726CAC8C">
+          <w:sz w:val="23"/>
+          <w:szCs w:val="23"/>
+          <w:lang w:val="en-GB"/>
+        </w:rPr>
+      </w:pPr>
+      <w:r>
+        <w:rPr>
+          <w:sz w:val="23"/>
+          <w:szCs w:val="23"/>
+          <w:lang w:val="en-GB"/>
+        </w:rPr>
+        <w:t>I seek Order</w:t>
+      </w:r>
+      <w:r>
+        <w:rPr>
+          <w:sz w:val="23"/>
+          <w:szCs w:val="23"/>
+          <w:lang w:val="en-GB"/>
+        </w:rPr>
+        <w:t>s</w:t>
+      </w:r>
+      <w:r>
+        <w:rPr>
+          <w:sz w:val="23"/>
+          <w:szCs w:val="23"/>
+          <w:lang w:val="en-GB"/>
+        </w:rPr>
+        <w:t xml:space="preserve"> granting the child and myself a Protection Order</w:t>
+      </w:r>
+      <w:r>
+        <w:rPr>
+          <w:sz w:val="23"/>
+          <w:szCs w:val="23"/>
+          <w:lang w:val="en-GB"/>
+        </w:rPr>
+        <w:t>, Tenancy and Ancillary Furniture</w:t>
+      </w:r>
+      <w:r>
+        <w:rPr>
+          <w:sz w:val="23"/>
+          <w:szCs w:val="23"/>
+          <w:lang w:val="en-GB"/>
+        </w:rPr>
+        <w:t xml:space="preserve"> against </w:t>
+      </w:r>
+      <w:r>
+        <w:rPr>
+          <w:rFonts w:cs="Arial"/>
+          <w:spacing w:val="-3"/>
+          <w:sz w:val="23"/>
+          <w:szCs w:val="23"/>
+          <w:lang w:val="en-GB"/>
+        </w:rPr>
+        <w:t>the</w:t>
+      </w:r>
+      <w:r>
+        <w:rPr>
+          <w:sz w:val="23"/>
+          <w:szCs w:val="23"/>
+          <w:lang w:val="en-GB"/>
+        </w:rPr>
+        <w:t xml:space="preserve"> Respondent.  I seek the standard conditions of a Protection Order.  I also seek a Parenting Order granting me the </w:t>
+      </w:r>
+      <w:proofErr w:type="gramStart"/>
+      <w:r>
+        <w:rPr>
+          <w:sz w:val="23"/>
+          <w:szCs w:val="23"/>
+          <w:lang w:val="en-GB"/>
+        </w:rPr>
+        <w:t>day to day</w:t>
+      </w:r>
+      <w:proofErr w:type="gramEnd"/>
+      <w:r>
+        <w:rPr>
+          <w:sz w:val="23"/>
+          <w:szCs w:val="23"/>
+          <w:lang w:val="en-GB"/>
+        </w:rPr>
+        <w:t xml:space="preserve"> care of the child. I request these orders are granted without notice to the Respondent.  </w:t>
+      </w:r>
+    </w:p>
+    <w:bookmarkEnd w:id="0"/>
+    <w:p>
       <w:pPr>
         <w:tabs>
           <w:tab w:val="left" w:pos="567"/>
@@ -1741,32 +2545,26 @@
         <w:ind w:right="-136"/>
         <w:jc w:val="both"/>
         <w:rPr>
-          <w:lang w:val="en-GB"/>
-        </w:rPr>
-      </w:pPr>
-      <w:r>
-        <w:rPr>
-          <w:b/>
-          <w:lang w:val="en-GB"/>
-        </w:rPr>
-        <w:t>AFFIRMED at            this</w:t>
-      </w:r>
-      <w:r>
-        <w:rPr>
-          <w:b/>
-          <w:lang w:val="en-GB"/>
-        </w:rPr>
-        <w:t/>
-      </w:r>
-      <w:r>
-        <w:rPr>
-          <w:b/>
-          <w:lang w:val="en-GB"/>
-        </w:rPr>
-        <w:t xml:space="preserve"/>
-      </w:r>
-    </w:p>
-    <w:p ns2:paraId="1B810B0D" ns2:textId="77777777">
+          <w:bCs/>
+          <w:lang w:val="en-GB"/>
+        </w:rPr>
+      </w:pPr>
+      <w:r>
+        <w:rPr>
+          <w:b/>
+          <w:lang w:val="en-GB"/>
+        </w:rPr>
+        <w:t xml:space="preserve">AFFIRMED </w:t>
+      </w:r>
+      <w:r>
+        <w:rPr>
+          <w:bCs/>
+          <w:lang w:val="en-GB"/>
+        </w:rPr>
+        <w:t>at            this</w:t>
+      </w:r>
+    </w:p>
+    <w:p>
       <w:pPr>
         <w:spacing w:line="240" w:lineRule="atLeast"/>
         <w:ind w:right="17"/>
@@ -1775,36 +2573,10 @@
         <w:rPr>
           <w:rFonts w:cs="Arial"/>
         </w:rPr>
-        <w:t>{{month_day}} day of {{month}} {{year}}</w:t>
-      </w:r>
-      <w:proofErr w:type="spellStart"/>
-      <w:r>
-        <w:rPr>
-          <w:rFonts w:cs="Arial"/>
-        </w:rPr>
-        <w:t/>
-      </w:r>
-      <w:proofErr w:type="spellEnd"/>
-      <w:r>
-        <w:rPr>
-          <w:rFonts w:cs="Arial"/>
-        </w:rPr>
-        <w:t/>
-      </w:r>
-      <w:r>
-        <w:rPr>
-          <w:rFonts w:cs="Arial"/>
-        </w:rPr>
-        <w:t xml:space="preserve"/>
-      </w:r>
-      <w:r>
-        <w:rPr>
-          <w:rFonts w:cs="Arial"/>
-        </w:rPr>
-        <w:t/>
-      </w:r>
-    </w:p>
-    <w:p ns2:paraId="4F5D7BB0" ns2:textId="77777777">
+        <w:t xml:space="preserve">day of </w:t>
+      </w:r>
+    </w:p>
+    <w:p>
       <w:pPr>
         <w:tabs>
           <w:tab w:val="left" w:pos="567"/>
@@ -1865,7 +2637,7 @@
         <w:t>_________________________</w:t>
       </w:r>
     </w:p>
-    <w:p ns2:paraId="505EF284" ns2:textId="77777777">
+    <w:p>
       <w:pPr>
         <w:tabs>
           <w:tab w:val="left" w:pos="567"/>
@@ -1933,7 +2705,7 @@
         <w:t>Applicant</w:t>
       </w:r>
     </w:p>
-    <w:p ns2:paraId="658A9B27" ns2:textId="77777777">
+    <w:p>
       <w:pPr>
         <w:tabs>
           <w:tab w:val="left" w:pos="567"/>
@@ -1951,7 +2723,7 @@
         <w:t xml:space="preserve">Before me: </w:t>
       </w:r>
     </w:p>
-    <w:p ns2:paraId="116F01E9" ns2:textId="77777777">
+    <w:p>
       <w:pPr>
         <w:tabs>
           <w:tab w:val="left" w:pos="567"/>
@@ -1963,7 +2735,7 @@
         </w:rPr>
       </w:pPr>
     </w:p>
-    <w:p ns2:paraId="6AA8F9D8" ns2:textId="77777777">
+    <w:p>
       <w:pPr>
         <w:tabs>
           <w:tab w:val="left" w:pos="567"/>
@@ -1975,7 +2747,7 @@
         </w:rPr>
       </w:pPr>
     </w:p>
-    <w:p ns2:paraId="6F85C821" ns2:textId="77777777">
+    <w:p>
       <w:pPr>
         <w:tabs>
           <w:tab w:val="left" w:pos="567"/>
@@ -1987,7 +2759,7 @@
         </w:rPr>
       </w:pPr>
     </w:p>
-    <w:p ns2:paraId="7A5B9312" ns2:textId="77777777">
+    <w:p>
       <w:pPr>
         <w:tabs>
           <w:tab w:val="left" w:pos="567"/>
@@ -2005,7 +2777,7 @@
         <w:t>__________________________________</w:t>
       </w:r>
     </w:p>
-    <w:p ns2:paraId="262607C3" ns2:textId="77777777">
+    <w:p>
       <w:pPr>
         <w:tabs>
           <w:tab w:val="left" w:pos="567"/>
@@ -2027,7 +2799,7 @@
         <w:t>Justice of the Peace/Deputy Registrar/</w:t>
       </w:r>
     </w:p>
-    <w:p ns2:paraId="1C047ED0" ns2:textId="77777777">
+    <w:p>
       <w:pPr>
         <w:tabs>
           <w:tab w:val="left" w:pos="567"/>
@@ -3500,6 +4272,95 @@
     </w:lvl>
   </w:abstractNum>
   <w:abstractNum w:abstractNumId="12" w15:restartNumberingAfterBreak="0">
+    <w:nsid w:val="4E637C7D"/>
+    <w:multiLevelType w:val="hybridMultilevel"/>
+    <w:tmpl w:val="6BC28532"/>
+    <w:lvl w:ilvl="0" w:tplc="29703116">
+      <w:start w:val="1"/>
+      <w:numFmt w:val="lowerLetter"/>
+      <w:lvlText w:val="(%1)"/>
+      <w:lvlJc w:val="left"/>
+      <w:pPr>
+        <w:ind w:left="1080" w:hanging="360"/>
+      </w:pPr>
+      <w:rPr>
+        <w:rFonts w:hint="default"/>
+      </w:rPr>
+    </w:lvl>
+    <w:lvl w:ilvl="1" w:tplc="08090019" w:tentative="1">
+      <w:start w:val="1"/>
+      <w:numFmt w:val="lowerLetter"/>
+      <w:lvlText w:val="%2."/>
+      <w:lvlJc w:val="left"/>
+      <w:pPr>
+        <w:ind w:left="1800" w:hanging="360"/>
+      </w:pPr>
+    </w:lvl>
+    <w:lvl w:ilvl="2" w:tplc="0809001B" w:tentative="1">
+      <w:start w:val="1"/>
+      <w:numFmt w:val="lowerRoman"/>
+      <w:lvlText w:val="%3."/>
+      <w:lvlJc w:val="right"/>
+      <w:pPr>
+        <w:ind w:left="2520" w:hanging="180"/>
+      </w:pPr>
+    </w:lvl>
+    <w:lvl w:ilvl="3" w:tplc="0809000F" w:tentative="1">
+      <w:start w:val="1"/>
+      <w:numFmt w:val="decimal"/>
+      <w:lvlText w:val="%4."/>
+      <w:lvlJc w:val="left"/>
+      <w:pPr>
+        <w:ind w:left="3240" w:hanging="360"/>
+      </w:pPr>
+    </w:lvl>
+    <w:lvl w:ilvl="4" w:tplc="08090019" w:tentative="1">
+      <w:start w:val="1"/>
+      <w:numFmt w:val="lowerLetter"/>
+      <w:lvlText w:val="%5."/>
+      <w:lvlJc w:val="left"/>
+      <w:pPr>
+        <w:ind w:left="3960" w:hanging="360"/>
+      </w:pPr>
+    </w:lvl>
+    <w:lvl w:ilvl="5" w:tplc="0809001B" w:tentative="1">
+      <w:start w:val="1"/>
+      <w:numFmt w:val="lowerRoman"/>
+      <w:lvlText w:val="%6."/>
+      <w:lvlJc w:val="right"/>
+      <w:pPr>
+        <w:ind w:left="4680" w:hanging="180"/>
+      </w:pPr>
+    </w:lvl>
+    <w:lvl w:ilvl="6" w:tplc="0809000F" w:tentative="1">
+      <w:start w:val="1"/>
+      <w:numFmt w:val="decimal"/>
+      <w:lvlText w:val="%7."/>
+      <w:lvlJc w:val="left"/>
+      <w:pPr>
+        <w:ind w:left="5400" w:hanging="360"/>
+      </w:pPr>
+    </w:lvl>
+    <w:lvl w:ilvl="7" w:tplc="08090019" w:tentative="1">
+      <w:start w:val="1"/>
+      <w:numFmt w:val="lowerLetter"/>
+      <w:lvlText w:val="%8."/>
+      <w:lvlJc w:val="left"/>
+      <w:pPr>
+        <w:ind w:left="6120" w:hanging="360"/>
+      </w:pPr>
+    </w:lvl>
+    <w:lvl w:ilvl="8" w:tplc="0809001B" w:tentative="1">
+      <w:start w:val="1"/>
+      <w:numFmt w:val="lowerRoman"/>
+      <w:lvlText w:val="%9."/>
+      <w:lvlJc w:val="right"/>
+      <w:pPr>
+        <w:ind w:left="6840" w:hanging="180"/>
+      </w:pPr>
+    </w:lvl>
+  </w:abstractNum>
+  <w:abstractNum w:abstractNumId="13" w15:restartNumberingAfterBreak="0">
     <w:nsid w:val="5B5E72BC"/>
     <w:multiLevelType w:val="hybridMultilevel"/>
     <w:tmpl w:val="0388CD9E"/>
@@ -3588,7 +4449,7 @@
       </w:pPr>
     </w:lvl>
   </w:abstractNum>
-  <w:abstractNum w:abstractNumId="13" w15:restartNumberingAfterBreak="0">
+  <w:abstractNum w:abstractNumId="14" w15:restartNumberingAfterBreak="0">
     <w:nsid w:val="6B486E2C"/>
     <w:multiLevelType w:val="hybridMultilevel"/>
     <w:tmpl w:val="1494D458"/>
@@ -3677,7 +4538,7 @@
       </w:pPr>
     </w:lvl>
   </w:abstractNum>
-  <w:abstractNum w:abstractNumId="14" w15:restartNumberingAfterBreak="0">
+  <w:abstractNum w:abstractNumId="15" w15:restartNumberingAfterBreak="0">
     <w:nsid w:val="6CB82CA2"/>
     <w:multiLevelType w:val="multilevel"/>
     <w:tmpl w:val="F5241E14"/>
@@ -3826,7 +4687,7 @@
       </w:rPr>
     </w:lvl>
   </w:abstractNum>
-  <w:abstractNum w:abstractNumId="15" w15:restartNumberingAfterBreak="0">
+  <w:abstractNum w:abstractNumId="16" w15:restartNumberingAfterBreak="0">
     <w:nsid w:val="6EE64D62"/>
     <w:multiLevelType w:val="hybridMultilevel"/>
     <w:tmpl w:val="20666CAA"/>
@@ -4126,16 +4987,16 @@
     </w:lvlOverride>
   </w:num>
   <w:num w:numId="8" w16cid:durableId="76753226">
-    <w:abstractNumId w:val="13"/>
+    <w:abstractNumId w:val="14"/>
   </w:num>
   <w:num w:numId="9" w16cid:durableId="685906757">
-    <w:abstractNumId w:val="15"/>
+    <w:abstractNumId w:val="16"/>
   </w:num>
   <w:num w:numId="10" w16cid:durableId="1246459527">
     <w:abstractNumId w:val="6"/>
   </w:num>
   <w:num w:numId="11" w16cid:durableId="1543245082">
-    <w:abstractNumId w:val="12"/>
+    <w:abstractNumId w:val="13"/>
   </w:num>
   <w:num w:numId="12" w16cid:durableId="1338848467">
     <w:abstractNumId w:val="8"/>
@@ -4174,13 +5035,76 @@
     <w:abstractNumId w:val="3"/>
   </w:num>
   <w:num w:numId="15" w16cid:durableId="1579287714">
-    <w:abstractNumId w:val="14"/>
+    <w:abstractNumId w:val="15"/>
   </w:num>
   <w:num w:numId="16" w16cid:durableId="2107378317">
     <w:abstractNumId w:val="0"/>
   </w:num>
   <w:num w:numId="17" w16cid:durableId="1931354042">
     <w:abstractNumId w:val="7"/>
+  </w:num>
+  <w:num w:numId="18" w16cid:durableId="1534221276">
+    <w:abstractNumId w:val="16"/>
+    <w:lvlOverride w:ilvl="0">
+      <w:startOverride w:val="1"/>
+    </w:lvlOverride>
+    <w:lvlOverride w:ilvl="1">
+      <w:startOverride w:val="1"/>
+    </w:lvlOverride>
+    <w:lvlOverride w:ilvl="2">
+      <w:startOverride w:val="1"/>
+    </w:lvlOverride>
+    <w:lvlOverride w:ilvl="3">
+      <w:startOverride w:val="1"/>
+    </w:lvlOverride>
+    <w:lvlOverride w:ilvl="4">
+      <w:startOverride w:val="1"/>
+    </w:lvlOverride>
+    <w:lvlOverride w:ilvl="5">
+      <w:startOverride w:val="1"/>
+    </w:lvlOverride>
+    <w:lvlOverride w:ilvl="6">
+      <w:startOverride w:val="1"/>
+    </w:lvlOverride>
+    <w:lvlOverride w:ilvl="7">
+      <w:startOverride w:val="1"/>
+    </w:lvlOverride>
+    <w:lvlOverride w:ilvl="8">
+      <w:startOverride w:val="1"/>
+    </w:lvlOverride>
+  </w:num>
+  <w:num w:numId="19" w16cid:durableId="1206408779">
+    <w:abstractNumId w:val="6"/>
+    <w:lvlOverride w:ilvl="0">
+      <w:startOverride w:val="1"/>
+    </w:lvlOverride>
+    <w:lvlOverride w:ilvl="1">
+      <w:startOverride w:val="1"/>
+    </w:lvlOverride>
+    <w:lvlOverride w:ilvl="2">
+      <w:startOverride w:val="1"/>
+    </w:lvlOverride>
+    <w:lvlOverride w:ilvl="3">
+      <w:startOverride w:val="1"/>
+    </w:lvlOverride>
+    <w:lvlOverride w:ilvl="4">
+      <w:startOverride w:val="1"/>
+    </w:lvlOverride>
+    <w:lvlOverride w:ilvl="5">
+      <w:startOverride w:val="1"/>
+    </w:lvlOverride>
+    <w:lvlOverride w:ilvl="6">
+      <w:startOverride w:val="1"/>
+    </w:lvlOverride>
+    <w:lvlOverride w:ilvl="7">
+      <w:startOverride w:val="1"/>
+    </w:lvlOverride>
+    <w:lvlOverride w:ilvl="8">
+      <w:startOverride w:val="1"/>
+    </w:lvlOverride>
+  </w:num>
+  <w:num w:numId="20" w16cid:durableId="248781058">
+    <w:abstractNumId w:val="12"/>
   </w:num>
 </w:numbering>
 </file>
@@ -4213,6 +5137,7 @@
     <w:lsdException w:name="Subtitle" w:qFormat="1"/>
     <w:lsdException w:name="Strong" w:qFormat="1"/>
     <w:lsdException w:name="Emphasis" w:qFormat="1"/>
+    <w:lsdException w:name="Normal (Web)" w:uiPriority="99"/>
     <w:lsdException w:name="Normal Table" w:semiHidden="1" w:unhideWhenUsed="1"/>
     <w:lsdException w:name="Table Simple 1" w:semiHidden="1" w:unhideWhenUsed="1"/>
     <w:lsdException w:name="Table Simple 2" w:semiHidden="1" w:unhideWhenUsed="1"/>
@@ -4638,6 +5563,32 @@
       <w:lang w:val="en-AU" w:eastAsia="en-US"/>
     </w:rPr>
   </w:style>
+  <w:style w:type="paragraph" w:customStyle="1" w:styleId="pdq2pgselectionanchorcontainer">
+    <w:name w:val="pdq2pg_selectionanchorcontainer"/>
+    <w:basedOn w:val="Normal"/>
+    <w:rsid w:val="00EA3561"/>
+    <w:pPr>
+      <w:spacing w:before="100" w:beforeAutospacing="1" w:after="100" w:afterAutospacing="1"/>
+    </w:pPr>
+    <w:rPr>
+      <w:rFonts w:ascii="Times New Roman" w:hAnsi="Times New Roman"/>
+      <w:lang w:val="en-NZ" w:eastAsia="en-GB"/>
+    </w:rPr>
+  </w:style>
+  <w:style w:type="paragraph" w:styleId="NormalWeb">
+    <w:name w:val="Normal (Web)"/>
+    <w:basedOn w:val="Normal"/>
+    <w:uiPriority w:val="99"/>
+    <w:unhideWhenUsed/>
+    <w:rsid w:val="00EA3561"/>
+    <w:pPr>
+      <w:spacing w:before="100" w:beforeAutospacing="1" w:after="100" w:afterAutospacing="1"/>
+    </w:pPr>
+    <w:rPr>
+      <w:rFonts w:ascii="Times New Roman" w:hAnsi="Times New Roman"/>
+      <w:lang w:val="en-NZ" w:eastAsia="en-GB"/>
+    </w:rPr>
+  </w:style>
 </w:styles>
 </file>
 

</xml_diff>